<commit_message>
docs: update SIGIP guides and vacation reports
</commit_message>
<xml_diff>
--- a/docs/Documento_Tecnico_Sistema_Gestion_Incidencias_v0.3.docx
+++ b/docs/Documento_Tecnico_Sistema_Gestion_Incidencias_v0.3.docx
@@ -73,6 +73,16 @@
           <w:sz w:val="22"/>
         </w:rPr>
         <w:t>Definición funcional, arquitectura y base de datos · Julio de 2026</w:t>
+      </w:r>
+    </w:p>
+    <w:p>
+      <w:pPr>
+        <w:rPr>
+          <w:rFonts w:hint="eastAsia"/>
+        </w:rPr>
+      </w:pPr>
+      <w:r>
+        <w:t xml:space="preserve">NOTA DE VIGENCIA (28 de septiembre de 2026): este documento v0.3 es una referencia histórica de diseño. Para el estado funcional actual consulte Contexto_Maestro_SIGIP_v4.md y los manuales de usuario. Los reportes de incidencias y saldos vacacionales, la vista previa, el PDF y el control por año de cargo ya están implementados; los reportes se calculan sin tabla propia.</w:t>
       </w:r>
     </w:p>
     <w:p>

</xml_diff>